<commit_message>
chỉnh lại câu a 0.1
</commit_message>
<xml_diff>
--- a/doc/03-LeTranQuangThanh.docx
+++ b/doc/03-LeTranQuangThanh.docx
@@ -789,7 +789,16 @@
           <w:sz w:val="26"/>
           <w:szCs w:val="26"/>
         </w:rPr>
-        <w:t>…loading</w:t>
+        <w:t>…loadin</w:t>
+      </w:r>
+      <w:r>
+        <w:rPr>
+          <w:rFonts w:ascii="Times New Roman" w:hAnsi="Times New Roman" w:cs="Times New Roman"/>
+          <w:b/>
+          <w:sz w:val="26"/>
+          <w:szCs w:val="26"/>
+        </w:rPr>
+        <w:t>g</w:t>
       </w:r>
     </w:p>
     <w:p>

</xml_diff>

<commit_message>
chỉnh lại câu a 0.2
</commit_message>
<xml_diff>
--- a/doc/03-LeTranQuangThanh.docx
+++ b/doc/03-LeTranQuangThanh.docx
@@ -790,6 +790,15 @@
           <w:szCs w:val="26"/>
         </w:rPr>
         <w:t>…loading</w:t>
+      </w:r>
+      <w:r>
+        <w:rPr>
+          <w:rFonts w:ascii="Times New Roman" w:hAnsi="Times New Roman" w:cs="Times New Roman"/>
+          <w:b/>
+          <w:sz w:val="26"/>
+          <w:szCs w:val="26"/>
+        </w:rPr>
+        <w:t>….99%</w:t>
       </w:r>
     </w:p>
     <w:p>

</xml_diff>

<commit_message>
chinh lai cau a 0.3
</commit_message>
<xml_diff>
--- a/doc/03-LeTranQuangThanh.docx
+++ b/doc/03-LeTranQuangThanh.docx
@@ -799,6 +799,15 @@
           <w:szCs w:val="26"/>
         </w:rPr>
         <w:t>….99%</w:t>
+      </w:r>
+      <w:r>
+        <w:rPr>
+          <w:rFonts w:ascii="Times New Roman" w:hAnsi="Times New Roman" w:cs="Times New Roman"/>
+          <w:b/>
+          <w:sz w:val="26"/>
+          <w:szCs w:val="26"/>
+        </w:rPr>
+        <w:t>....100%</w:t>
       </w:r>
     </w:p>
     <w:p>

</xml_diff>

<commit_message>
Bản báo cáo final
</commit_message>
<xml_diff>
--- a/doc/03-LeTranQuangThanh.docx
+++ b/doc/03-LeTranQuangThanh.docx
@@ -15548,27 +15548,7 @@
           <w:sz w:val="26"/>
           <w:szCs w:val="26"/>
         </w:rPr>
-        <w:t xml:space="preserve"> </w:t>
-      </w:r>
-      <w:r>
-        <w:rPr>
-          <w:rFonts w:ascii="Times New Roman" w:hAnsi="Times New Roman" w:cs="Times New Roman"/>
-          <w:b/>
-          <w:bCs/>
-          <w:sz w:val="26"/>
-          <w:szCs w:val="26"/>
-        </w:rPr>
-        <w:t>2</w:t>
-      </w:r>
-      <w:r>
-        <w:rPr>
-          <w:rFonts w:ascii="Times New Roman" w:hAnsi="Times New Roman" w:cs="Times New Roman"/>
-          <w:b/>
-          <w:bCs/>
-          <w:sz w:val="26"/>
-          <w:szCs w:val="26"/>
-        </w:rPr>
-        <w:t xml:space="preserve">. </w:t>
+        <w:t xml:space="preserve"> 2. </w:t>
       </w:r>
       <w:proofErr w:type="spellStart"/>
       <w:r>
@@ -16510,27 +16490,7 @@
           <w:sz w:val="26"/>
           <w:szCs w:val="26"/>
         </w:rPr>
-        <w:t xml:space="preserve"> </w:t>
-      </w:r>
-      <w:r>
-        <w:rPr>
-          <w:rFonts w:ascii="Times New Roman" w:hAnsi="Times New Roman" w:cs="Times New Roman"/>
-          <w:b/>
-          <w:bCs/>
-          <w:sz w:val="26"/>
-          <w:szCs w:val="26"/>
-        </w:rPr>
-        <w:t>3</w:t>
-      </w:r>
-      <w:r>
-        <w:rPr>
-          <w:rFonts w:ascii="Times New Roman" w:hAnsi="Times New Roman" w:cs="Times New Roman"/>
-          <w:b/>
-          <w:bCs/>
-          <w:sz w:val="26"/>
-          <w:szCs w:val="26"/>
-        </w:rPr>
-        <w:t xml:space="preserve">. </w:t>
+        <w:t xml:space="preserve"> 3. </w:t>
       </w:r>
       <w:proofErr w:type="spellStart"/>
       <w:r>
@@ -17812,7 +17772,25 @@
           <w:sz w:val="26"/>
           <w:szCs w:val="26"/>
         </w:rPr>
-        <w:t xml:space="preserve"> lý </w:t>
+        <w:t xml:space="preserve"> </w:t>
+      </w:r>
+      <w:proofErr w:type="spellStart"/>
+      <w:r>
+        <w:rPr>
+          <w:rFonts w:ascii="Times New Roman" w:hAnsi="Times New Roman" w:cs="Times New Roman"/>
+          <w:sz w:val="26"/>
+          <w:szCs w:val="26"/>
+        </w:rPr>
+        <w:t>lý</w:t>
+      </w:r>
+      <w:proofErr w:type="spellEnd"/>
+      <w:r>
+        <w:rPr>
+          <w:rFonts w:ascii="Times New Roman" w:hAnsi="Times New Roman" w:cs="Times New Roman"/>
+          <w:sz w:val="26"/>
+          <w:szCs w:val="26"/>
+        </w:rPr>
+        <w:t xml:space="preserve"> </w:t>
       </w:r>
       <w:proofErr w:type="spellStart"/>
       <w:r>
@@ -18412,27 +18390,7 @@
           <w:sz w:val="26"/>
           <w:szCs w:val="26"/>
         </w:rPr>
-        <w:t xml:space="preserve"> </w:t>
-      </w:r>
-      <w:r>
-        <w:rPr>
-          <w:rFonts w:ascii="Times New Roman" w:hAnsi="Times New Roman" w:cs="Times New Roman"/>
-          <w:b/>
-          <w:bCs/>
-          <w:sz w:val="26"/>
-          <w:szCs w:val="26"/>
-        </w:rPr>
-        <w:t>5</w:t>
-      </w:r>
-      <w:r>
-        <w:rPr>
-          <w:rFonts w:ascii="Times New Roman" w:hAnsi="Times New Roman" w:cs="Times New Roman"/>
-          <w:b/>
-          <w:bCs/>
-          <w:sz w:val="26"/>
-          <w:szCs w:val="26"/>
-        </w:rPr>
-        <w:t xml:space="preserve">. </w:t>
+        <w:t xml:space="preserve"> 5. </w:t>
       </w:r>
       <w:r>
         <w:rPr>
@@ -19623,27 +19581,7 @@
           <w:sz w:val="26"/>
           <w:szCs w:val="26"/>
         </w:rPr>
-        <w:t xml:space="preserve"> </w:t>
-      </w:r>
-      <w:r>
-        <w:rPr>
-          <w:rFonts w:ascii="Times New Roman" w:hAnsi="Times New Roman" w:cs="Times New Roman"/>
-          <w:b/>
-          <w:bCs/>
-          <w:sz w:val="26"/>
-          <w:szCs w:val="26"/>
-        </w:rPr>
-        <w:t>6</w:t>
-      </w:r>
-      <w:r>
-        <w:rPr>
-          <w:rFonts w:ascii="Times New Roman" w:hAnsi="Times New Roman" w:cs="Times New Roman"/>
-          <w:b/>
-          <w:bCs/>
-          <w:sz w:val="26"/>
-          <w:szCs w:val="26"/>
-        </w:rPr>
-        <w:t xml:space="preserve">. </w:t>
+        <w:t xml:space="preserve"> 6. </w:t>
       </w:r>
       <w:proofErr w:type="spellStart"/>
       <w:r>
@@ -21082,7 +21020,25 @@
           <w:sz w:val="26"/>
           <w:szCs w:val="26"/>
         </w:rPr>
-        <w:t xml:space="preserve"> sĩ / </w:t>
+        <w:t xml:space="preserve"> </w:t>
+      </w:r>
+      <w:proofErr w:type="spellStart"/>
+      <w:r>
+        <w:rPr>
+          <w:rFonts w:ascii="Times New Roman" w:hAnsi="Times New Roman" w:cs="Times New Roman"/>
+          <w:sz w:val="26"/>
+          <w:szCs w:val="26"/>
+        </w:rPr>
+        <w:t>sĩ</w:t>
+      </w:r>
+      <w:proofErr w:type="spellEnd"/>
+      <w:r>
+        <w:rPr>
+          <w:rFonts w:ascii="Times New Roman" w:hAnsi="Times New Roman" w:cs="Times New Roman"/>
+          <w:sz w:val="26"/>
+          <w:szCs w:val="26"/>
+        </w:rPr>
+        <w:t xml:space="preserve"> / </w:t>
       </w:r>
       <w:proofErr w:type="spellStart"/>
       <w:r>
@@ -21952,27 +21908,7 @@
           <w:sz w:val="26"/>
           <w:szCs w:val="26"/>
         </w:rPr>
-        <w:t xml:space="preserve"> </w:t>
-      </w:r>
-      <w:r>
-        <w:rPr>
-          <w:rFonts w:ascii="Times New Roman" w:hAnsi="Times New Roman" w:cs="Times New Roman"/>
-          <w:b/>
-          <w:bCs/>
-          <w:sz w:val="26"/>
-          <w:szCs w:val="26"/>
-        </w:rPr>
-        <w:t>2</w:t>
-      </w:r>
-      <w:r>
-        <w:rPr>
-          <w:rFonts w:ascii="Times New Roman" w:hAnsi="Times New Roman" w:cs="Times New Roman"/>
-          <w:b/>
-          <w:bCs/>
-          <w:sz w:val="26"/>
-          <w:szCs w:val="26"/>
-        </w:rPr>
-        <w:t xml:space="preserve">. </w:t>
+        <w:t xml:space="preserve"> 2. </w:t>
       </w:r>
       <w:proofErr w:type="spellStart"/>
       <w:r>
@@ -22192,17 +22128,7 @@
           <w:sz w:val="26"/>
           <w:szCs w:val="26"/>
         </w:rPr>
-        <w:t>):</w:t>
-      </w:r>
-      <w:r>
-        <w:rPr>
-          <w:rFonts w:ascii="Times New Roman" w:hAnsi="Times New Roman" w:cs="Times New Roman"/>
-          <w:b/>
-          <w:bCs/>
-          <w:sz w:val="26"/>
-          <w:szCs w:val="26"/>
-        </w:rPr>
-        <w:t xml:space="preserve"> </w:t>
+        <w:t xml:space="preserve">): </w:t>
       </w:r>
       <w:proofErr w:type="spellStart"/>
       <w:r>
@@ -23144,27 +23070,7 @@
           <w:sz w:val="26"/>
           <w:szCs w:val="26"/>
         </w:rPr>
-        <w:t xml:space="preserve"> </w:t>
-      </w:r>
-      <w:r>
-        <w:rPr>
-          <w:rFonts w:ascii="Times New Roman" w:hAnsi="Times New Roman" w:cs="Times New Roman"/>
-          <w:b/>
-          <w:bCs/>
-          <w:sz w:val="26"/>
-          <w:szCs w:val="26"/>
-        </w:rPr>
-        <w:t>3</w:t>
-      </w:r>
-      <w:r>
-        <w:rPr>
-          <w:rFonts w:ascii="Times New Roman" w:hAnsi="Times New Roman" w:cs="Times New Roman"/>
-          <w:b/>
-          <w:bCs/>
-          <w:sz w:val="26"/>
-          <w:szCs w:val="26"/>
-        </w:rPr>
-        <w:t xml:space="preserve">. </w:t>
+        <w:t xml:space="preserve"> 3. </w:t>
       </w:r>
       <w:proofErr w:type="spellStart"/>
       <w:r>
@@ -23384,17 +23290,7 @@
           <w:sz w:val="26"/>
           <w:szCs w:val="26"/>
         </w:rPr>
-        <w:t>):</w:t>
-      </w:r>
-      <w:r>
-        <w:rPr>
-          <w:rFonts w:ascii="Times New Roman" w:hAnsi="Times New Roman" w:cs="Times New Roman"/>
-          <w:b/>
-          <w:bCs/>
-          <w:sz w:val="26"/>
-          <w:szCs w:val="26"/>
-        </w:rPr>
-        <w:t xml:space="preserve"> </w:t>
+        <w:t xml:space="preserve">): </w:t>
       </w:r>
       <w:proofErr w:type="spellStart"/>
       <w:r>
@@ -24210,27 +24106,7 @@
           <w:sz w:val="26"/>
           <w:szCs w:val="26"/>
         </w:rPr>
-        <w:t xml:space="preserve"> </w:t>
-      </w:r>
-      <w:r>
-        <w:rPr>
-          <w:rFonts w:ascii="Times New Roman" w:hAnsi="Times New Roman" w:cs="Times New Roman"/>
-          <w:b/>
-          <w:bCs/>
-          <w:sz w:val="26"/>
-          <w:szCs w:val="26"/>
-        </w:rPr>
-        <w:t>4</w:t>
-      </w:r>
-      <w:r>
-        <w:rPr>
-          <w:rFonts w:ascii="Times New Roman" w:hAnsi="Times New Roman" w:cs="Times New Roman"/>
-          <w:b/>
-          <w:bCs/>
-          <w:sz w:val="26"/>
-          <w:szCs w:val="26"/>
-        </w:rPr>
-        <w:t xml:space="preserve">. </w:t>
+        <w:t xml:space="preserve"> 4. </w:t>
       </w:r>
       <w:proofErr w:type="spellStart"/>
       <w:r>
@@ -24384,17 +24260,7 @@
           <w:sz w:val="26"/>
           <w:szCs w:val="26"/>
         </w:rPr>
-        <w:t>:</w:t>
-      </w:r>
-      <w:r>
-        <w:rPr>
-          <w:rFonts w:ascii="Times New Roman" w:hAnsi="Times New Roman" w:cs="Times New Roman"/>
-          <w:b/>
-          <w:bCs/>
-          <w:sz w:val="26"/>
-          <w:szCs w:val="26"/>
-        </w:rPr>
-        <w:t xml:space="preserve"> </w:t>
+        <w:t xml:space="preserve">: </w:t>
       </w:r>
       <w:proofErr w:type="spellStart"/>
       <w:r>
@@ -25210,27 +25076,7 @@
           <w:sz w:val="26"/>
           <w:szCs w:val="26"/>
         </w:rPr>
-        <w:t xml:space="preserve"> </w:t>
-      </w:r>
-      <w:r>
-        <w:rPr>
-          <w:rFonts w:ascii="Times New Roman" w:hAnsi="Times New Roman" w:cs="Times New Roman"/>
-          <w:b/>
-          <w:bCs/>
-          <w:sz w:val="26"/>
-          <w:szCs w:val="26"/>
-        </w:rPr>
-        <w:t>5</w:t>
-      </w:r>
-      <w:r>
-        <w:rPr>
-          <w:rFonts w:ascii="Times New Roman" w:hAnsi="Times New Roman" w:cs="Times New Roman"/>
-          <w:b/>
-          <w:bCs/>
-          <w:sz w:val="26"/>
-          <w:szCs w:val="26"/>
-        </w:rPr>
-        <w:t xml:space="preserve">. </w:t>
+        <w:t xml:space="preserve"> 5. </w:t>
       </w:r>
       <w:proofErr w:type="spellStart"/>
       <w:r>
@@ -25406,17 +25252,7 @@
           <w:sz w:val="26"/>
           <w:szCs w:val="26"/>
         </w:rPr>
-        <w:t>:</w:t>
-      </w:r>
-      <w:r>
-        <w:rPr>
-          <w:rFonts w:ascii="Times New Roman" w:hAnsi="Times New Roman" w:cs="Times New Roman"/>
-          <w:b/>
-          <w:bCs/>
-          <w:sz w:val="26"/>
-          <w:szCs w:val="26"/>
-        </w:rPr>
-        <w:t xml:space="preserve"> </w:t>
+        <w:t xml:space="preserve">: </w:t>
       </w:r>
       <w:proofErr w:type="spellStart"/>
       <w:r>
@@ -26763,7 +26599,25 @@
           <w:sz w:val="26"/>
           <w:szCs w:val="26"/>
         </w:rPr>
-        <w:t xml:space="preserve"> sĩ &amp; </w:t>
+        <w:t xml:space="preserve"> </w:t>
+      </w:r>
+      <w:proofErr w:type="spellStart"/>
+      <w:r>
+        <w:rPr>
+          <w:rFonts w:ascii="Times New Roman" w:hAnsi="Times New Roman" w:cs="Times New Roman"/>
+          <w:sz w:val="26"/>
+          <w:szCs w:val="26"/>
+        </w:rPr>
+        <w:t>sĩ</w:t>
+      </w:r>
+      <w:proofErr w:type="spellEnd"/>
+      <w:r>
+        <w:rPr>
+          <w:rFonts w:ascii="Times New Roman" w:hAnsi="Times New Roman" w:cs="Times New Roman"/>
+          <w:sz w:val="26"/>
+          <w:szCs w:val="26"/>
+        </w:rPr>
+        <w:t xml:space="preserve"> &amp; </w:t>
       </w:r>
       <w:proofErr w:type="spellStart"/>
       <w:r>
@@ -29745,7 +29599,6 @@
         <w:t xml:space="preserve"> </w:t>
       </w:r>
       <w:proofErr w:type="spellStart"/>
-      <w:proofErr w:type="gramStart"/>
       <w:r>
         <w:rPr>
           <w:rFonts w:ascii="Times New Roman" w:hAnsi="Times New Roman" w:cs="Times New Roman"/>
@@ -29757,7 +29610,6 @@
         <w:t>Đọc</w:t>
       </w:r>
       <w:proofErr w:type="spellEnd"/>
-      <w:proofErr w:type="gramEnd"/>
       <w:r>
         <w:rPr>
           <w:rFonts w:ascii="Times New Roman" w:hAnsi="Times New Roman" w:cs="Times New Roman"/>
@@ -32048,7 +31900,25 @@
           <w:sz w:val="26"/>
           <w:szCs w:val="26"/>
         </w:rPr>
-        <w:t xml:space="preserve"> sĩ &amp; </w:t>
+        <w:t xml:space="preserve"> </w:t>
+      </w:r>
+      <w:proofErr w:type="spellStart"/>
+      <w:r>
+        <w:rPr>
+          <w:rFonts w:ascii="Times New Roman" w:hAnsi="Times New Roman" w:cs="Times New Roman"/>
+          <w:sz w:val="26"/>
+          <w:szCs w:val="26"/>
+        </w:rPr>
+        <w:t>sĩ</w:t>
+      </w:r>
+      <w:proofErr w:type="spellEnd"/>
+      <w:r>
+        <w:rPr>
+          <w:rFonts w:ascii="Times New Roman" w:hAnsi="Times New Roman" w:cs="Times New Roman"/>
+          <w:sz w:val="26"/>
+          <w:szCs w:val="26"/>
+        </w:rPr>
+        <w:t xml:space="preserve"> &amp; </w:t>
       </w:r>
       <w:proofErr w:type="spellStart"/>
       <w:r>
@@ -36087,16 +35957,7 @@
           <w:sz w:val="26"/>
           <w:szCs w:val="26"/>
         </w:rPr>
-        <w:t xml:space="preserve"> Check-in"</w:t>
-      </w:r>
-      <w:r>
-        <w:rPr>
-          <w:rFonts w:ascii="Times New Roman" w:hAnsi="Times New Roman" w:cs="Times New Roman"/>
-          <w:bCs/>
-          <w:sz w:val="26"/>
-          <w:szCs w:val="26"/>
-        </w:rPr>
-        <w:t>.</w:t>
+        <w:t xml:space="preserve"> Check-in".</w:t>
       </w:r>
     </w:p>
     <w:p>
@@ -38761,7 +38622,7 @@
         <w:jc w:val="both"/>
         <w:rPr>
           <w:rFonts w:ascii="Times New Roman" w:hAnsi="Times New Roman" w:cs="Times New Roman"/>
-          <w:b/>
+          <w:bCs/>
           <w:sz w:val="26"/>
           <w:szCs w:val="26"/>
         </w:rPr>
@@ -39355,6 +39216,32 @@
         <w:t>khám</w:t>
       </w:r>
       <w:proofErr w:type="spellEnd"/>
+    </w:p>
+    <w:p>
+      <w:pPr>
+        <w:pStyle w:val="ListParagraph"/>
+        <w:spacing w:after="120" w:line="240" w:lineRule="auto"/>
+        <w:jc w:val="both"/>
+        <w:rPr>
+          <w:rFonts w:ascii="Times New Roman" w:hAnsi="Times New Roman" w:cs="Times New Roman"/>
+          <w:b/>
+          <w:sz w:val="26"/>
+          <w:szCs w:val="26"/>
+        </w:rPr>
+      </w:pPr>
+    </w:p>
+    <w:p>
+      <w:pPr>
+        <w:pStyle w:val="ListParagraph"/>
+        <w:spacing w:after="120" w:line="240" w:lineRule="auto"/>
+        <w:jc w:val="both"/>
+        <w:rPr>
+          <w:rFonts w:ascii="Times New Roman" w:hAnsi="Times New Roman" w:cs="Times New Roman"/>
+          <w:b/>
+          <w:sz w:val="26"/>
+          <w:szCs w:val="26"/>
+        </w:rPr>
+      </w:pPr>
     </w:p>
     <w:p>
       <w:pPr>
@@ -39901,20 +39788,8 @@
                 <w:sz w:val="26"/>
                 <w:szCs w:val="26"/>
               </w:rPr>
-              <w:t xml:space="preserve"> </w:t>
+              <w:t xml:space="preserve"> chú</w:t>
             </w:r>
-            <w:proofErr w:type="spellStart"/>
-            <w:r>
-              <w:rPr>
-                <w:rFonts w:ascii="Times New Roman" w:hAnsi="Times New Roman" w:cs="Times New Roman"/>
-                <w:b/>
-                <w:i/>
-                <w:sz w:val="26"/>
-                <w:szCs w:val="26"/>
-              </w:rPr>
-              <w:t>chú</w:t>
-            </w:r>
-            <w:proofErr w:type="spellEnd"/>
           </w:p>
         </w:tc>
       </w:tr>
@@ -40963,6 +40838,7 @@
           <w:sz w:val="26"/>
           <w:szCs w:val="26"/>
         </w:rPr>
+        <w:lastRenderedPageBreak/>
         <w:t>Sơ</w:t>
       </w:r>
       <w:proofErr w:type="spellEnd"/>
@@ -41403,22 +41279,8 @@
           <w:sz w:val="26"/>
           <w:szCs w:val="26"/>
         </w:rPr>
-        <w:t xml:space="preserve"> </w:t>
-      </w:r>
-      <w:proofErr w:type="spellStart"/>
-      <w:r>
-        <w:rPr>
-          <w:rFonts w:ascii="Times New Roman" w:hAnsi="Times New Roman" w:cs="Times New Roman"/>
-          <w:b/>
-          <w:i/>
-          <w:iCs/>
-          <w:color w:val="FF0000"/>
-          <w:sz w:val="26"/>
-          <w:szCs w:val="26"/>
-        </w:rPr>
-        <w:t>ký</w:t>
-      </w:r>
-      <w:proofErr w:type="spellEnd"/>
+        <w:t xml:space="preserve"> ký</w:t>
+      </w:r>
     </w:p>
     <w:p>
       <w:pPr>
@@ -45795,6 +45657,7 @@
   <w:style w:type="character" w:default="1" w:styleId="DefaultParagraphFont">
     <w:name w:val="Default Paragraph Font"/>
     <w:uiPriority w:val="1"/>
+    <w:semiHidden/>
     <w:unhideWhenUsed/>
   </w:style>
   <w:style w:type="table" w:default="1" w:styleId="TableNormal">

</xml_diff>

<commit_message>
Update Báo cáo L2
</commit_message>
<xml_diff>
--- a/doc/03-LeTranQuangThanh.docx
+++ b/doc/03-LeTranQuangThanh.docx
@@ -123,18 +123,7 @@
           <w:sz w:val="26"/>
           <w:szCs w:val="26"/>
         </w:rPr>
-        <w:t xml:space="preserve">- Thành viên </w:t>
-      </w:r>
-      <w:proofErr w:type="gramStart"/>
-      <w:r>
-        <w:rPr>
-          <w:rFonts w:ascii="Times New Roman" w:hAnsi="Times New Roman" w:cs="Times New Roman"/>
-          <w:b/>
-          <w:bCs/>
-          <w:sz w:val="26"/>
-          <w:szCs w:val="26"/>
-        </w:rPr>
-        <w:t>nhóm</w:t>
+        <w:t>- Thành viên nhóm</w:t>
       </w:r>
       <w:r>
         <w:rPr>
@@ -146,7 +135,6 @@
         </w:rPr>
         <w:t xml:space="preserve"> :</w:t>
       </w:r>
-      <w:proofErr w:type="gramEnd"/>
     </w:p>
     <w:p>
       <w:pPr>
@@ -3355,6 +3343,226 @@
         <w:rPr>
           <w:rFonts w:ascii="Times New Roman" w:hAnsi="Times New Roman" w:cs="Times New Roman"/>
           <w:b/>
+          <w:sz w:val="26"/>
+          <w:szCs w:val="26"/>
+        </w:rPr>
+      </w:pPr>
+    </w:p>
+    <w:p>
+      <w:pPr>
+        <w:spacing w:after="120" w:line="360" w:lineRule="auto"/>
+        <w:ind w:firstLine="720"/>
+        <w:jc w:val="both"/>
+        <w:rPr>
+          <w:rFonts w:ascii="Times New Roman" w:hAnsi="Times New Roman" w:cs="Times New Roman"/>
+          <w:b/>
+          <w:sz w:val="26"/>
+          <w:szCs w:val="26"/>
+        </w:rPr>
+      </w:pPr>
+      <w:r>
+        <w:rPr>
+          <w:rFonts w:ascii="Times New Roman" w:hAnsi="Times New Roman" w:cs="Times New Roman"/>
+          <w:b/>
+          <w:bCs/>
+          <w:sz w:val="26"/>
+          <w:szCs w:val="26"/>
+        </w:rPr>
+        <w:t xml:space="preserve">Quy định </w:t>
+      </w:r>
+      <w:r>
+        <w:rPr>
+          <w:rFonts w:ascii="Times New Roman" w:hAnsi="Times New Roman" w:cs="Times New Roman"/>
+          <w:b/>
+          <w:bCs/>
+          <w:sz w:val="26"/>
+          <w:szCs w:val="26"/>
+        </w:rPr>
+        <w:t>6</w:t>
+      </w:r>
+      <w:r>
+        <w:rPr>
+          <w:rFonts w:ascii="Times New Roman" w:hAnsi="Times New Roman" w:cs="Times New Roman"/>
+          <w:b/>
+          <w:bCs/>
+          <w:sz w:val="26"/>
+          <w:szCs w:val="26"/>
+        </w:rPr>
+        <w:t>:</w:t>
+      </w:r>
+      <w:r>
+        <w:rPr>
+          <w:rFonts w:ascii="Times New Roman" w:hAnsi="Times New Roman" w:cs="Times New Roman"/>
+          <w:bCs/>
+          <w:sz w:val="26"/>
+          <w:szCs w:val="26"/>
+        </w:rPr>
+        <w:t xml:space="preserve"> </w:t>
+      </w:r>
+      <w:r>
+        <w:rPr>
+          <w:rFonts w:ascii="Times New Roman" w:hAnsi="Times New Roman" w:cs="Times New Roman"/>
+          <w:b/>
+          <w:sz w:val="26"/>
+          <w:szCs w:val="26"/>
+        </w:rPr>
+        <w:t xml:space="preserve">Về khả năng truy cập thông tin trước phiên khám. </w:t>
+      </w:r>
+    </w:p>
+    <w:p>
+      <w:pPr>
+        <w:spacing w:after="120" w:line="276" w:lineRule="auto"/>
+        <w:ind w:left="720"/>
+        <w:jc w:val="both"/>
+        <w:rPr>
+          <w:rFonts w:ascii="Times New Roman" w:hAnsi="Times New Roman" w:cs="Times New Roman"/>
+          <w:bCs/>
+          <w:sz w:val="26"/>
+          <w:szCs w:val="26"/>
+        </w:rPr>
+      </w:pPr>
+      <w:r>
+        <w:rPr>
+          <w:rFonts w:ascii="Times New Roman" w:hAnsi="Times New Roman" w:cs="Times New Roman"/>
+          <w:bCs/>
+          <w:sz w:val="26"/>
+          <w:szCs w:val="26"/>
+        </w:rPr>
+        <w:t>Hệ thống phải cho phép tài khoản Y tá (hoặc Trợ lý nha khoa) xem trước "Lý do đến khám", thông tin cơ bản và các dịch vụ dự kiến (nếu có) của bệnh nhân ngay khi trạng thái hồ sơ ở mức "Hoàn tất Check-in" / "Đang chờ khám", nhằm làm căn cứ chuẩn bị đúng và đủ dụng cụ, vật tư y tế.</w:t>
+      </w:r>
+    </w:p>
+    <w:p>
+      <w:pPr>
+        <w:spacing w:after="120" w:line="276" w:lineRule="auto"/>
+        <w:ind w:left="720"/>
+        <w:jc w:val="both"/>
+        <w:rPr>
+          <w:rFonts w:ascii="Times New Roman" w:hAnsi="Times New Roman" w:cs="Times New Roman"/>
+          <w:bCs/>
+          <w:sz w:val="26"/>
+          <w:szCs w:val="26"/>
+        </w:rPr>
+      </w:pPr>
+    </w:p>
+    <w:p>
+      <w:pPr>
+        <w:spacing w:after="120" w:line="360" w:lineRule="auto"/>
+        <w:ind w:firstLine="720"/>
+        <w:jc w:val="both"/>
+        <w:rPr>
+          <w:rFonts w:ascii="Times New Roman" w:hAnsi="Times New Roman" w:cs="Times New Roman"/>
+          <w:bCs/>
+          <w:sz w:val="26"/>
+          <w:szCs w:val="26"/>
+        </w:rPr>
+      </w:pPr>
+      <w:r>
+        <w:rPr>
+          <w:rFonts w:ascii="Times New Roman" w:hAnsi="Times New Roman" w:cs="Times New Roman"/>
+          <w:b/>
+          <w:bCs/>
+          <w:sz w:val="26"/>
+          <w:szCs w:val="26"/>
+        </w:rPr>
+        <w:t xml:space="preserve">Quy định </w:t>
+      </w:r>
+      <w:r>
+        <w:rPr>
+          <w:rFonts w:ascii="Times New Roman" w:hAnsi="Times New Roman" w:cs="Times New Roman"/>
+          <w:b/>
+          <w:bCs/>
+          <w:sz w:val="26"/>
+          <w:szCs w:val="26"/>
+        </w:rPr>
+        <w:t>7</w:t>
+      </w:r>
+      <w:r>
+        <w:rPr>
+          <w:rFonts w:ascii="Times New Roman" w:hAnsi="Times New Roman" w:cs="Times New Roman"/>
+          <w:b/>
+          <w:bCs/>
+          <w:sz w:val="26"/>
+          <w:szCs w:val="26"/>
+        </w:rPr>
+        <w:t>:</w:t>
+      </w:r>
+      <w:r>
+        <w:rPr>
+          <w:rFonts w:ascii="Times New Roman" w:hAnsi="Times New Roman" w:cs="Times New Roman"/>
+          <w:bCs/>
+          <w:sz w:val="26"/>
+          <w:szCs w:val="26"/>
+        </w:rPr>
+        <w:t xml:space="preserve"> </w:t>
+      </w:r>
+      <w:r>
+        <w:rPr>
+          <w:rFonts w:ascii="Times New Roman" w:hAnsi="Times New Roman" w:cs="Times New Roman"/>
+          <w:b/>
+          <w:sz w:val="26"/>
+          <w:szCs w:val="26"/>
+        </w:rPr>
+        <w:t>Về</w:t>
+      </w:r>
+      <w:r>
+        <w:rPr>
+          <w:rFonts w:ascii="Times New Roman" w:hAnsi="Times New Roman" w:cs="Times New Roman"/>
+          <w:bCs/>
+          <w:sz w:val="26"/>
+          <w:szCs w:val="26"/>
+        </w:rPr>
+        <w:t xml:space="preserve"> </w:t>
+      </w:r>
+      <w:r>
+        <w:rPr>
+          <w:rFonts w:ascii="Times New Roman" w:hAnsi="Times New Roman" w:cs="Times New Roman"/>
+          <w:b/>
+          <w:sz w:val="26"/>
+          <w:szCs w:val="26"/>
+        </w:rPr>
+        <w:t>ràng buộc trạng thái sẵn sàng của phòng khám.</w:t>
+      </w:r>
+      <w:r>
+        <w:rPr>
+          <w:rFonts w:ascii="Times New Roman" w:hAnsi="Times New Roman" w:cs="Times New Roman"/>
+          <w:bCs/>
+          <w:sz w:val="26"/>
+          <w:szCs w:val="26"/>
+        </w:rPr>
+        <w:t xml:space="preserve"> </w:t>
+      </w:r>
+    </w:p>
+    <w:p>
+      <w:pPr>
+        <w:spacing w:after="120" w:line="276" w:lineRule="auto"/>
+        <w:ind w:left="720"/>
+        <w:jc w:val="both"/>
+        <w:rPr>
+          <w:rFonts w:ascii="Times New Roman" w:hAnsi="Times New Roman" w:cs="Times New Roman"/>
+          <w:bCs/>
+          <w:sz w:val="26"/>
+          <w:szCs w:val="26"/>
+        </w:rPr>
+      </w:pPr>
+      <w:r>
+        <w:rPr>
+          <w:rFonts w:ascii="Times New Roman" w:hAnsi="Times New Roman" w:cs="Times New Roman"/>
+          <w:bCs/>
+          <w:sz w:val="26"/>
+          <w:szCs w:val="26"/>
+        </w:rPr>
+        <w:lastRenderedPageBreak/>
+        <w:t>Hệ thống chỉ cho phép thao tác "Bắt đầu khám" (chuyển trạng thái bệnh nhân sang "Đang tiến hành khám") khi phòng khám đó đã được Y tá xác nhận trạng thái "Đã chuẩn bị xong" (hoặc "Sẵn sàng") trên hệ thống.</w:t>
+      </w:r>
+    </w:p>
+    <w:p>
+      <w:pPr>
+        <w:spacing w:after="120" w:line="276" w:lineRule="auto"/>
+        <w:ind w:left="720"/>
+        <w:jc w:val="both"/>
+        <w:rPr>
+          <w:rFonts w:ascii="Times New Roman" w:hAnsi="Times New Roman" w:cs="Times New Roman"/>
+          <w:bCs/>
           <w:sz w:val="26"/>
           <w:szCs w:val="26"/>
         </w:rPr>
@@ -4006,7 +4214,6 @@
                 <w:sz w:val="26"/>
                 <w:szCs w:val="26"/>
               </w:rPr>
-              <w:lastRenderedPageBreak/>
               <w:t>6.</w:t>
             </w:r>
           </w:p>
@@ -8926,6 +9133,7 @@
   <w:style w:type="character" w:default="1" w:styleId="DefaultParagraphFont">
     <w:name w:val="Default Paragraph Font"/>
     <w:uiPriority w:val="1"/>
+    <w:semiHidden/>
     <w:unhideWhenUsed/>
   </w:style>
   <w:style w:type="table" w:default="1" w:styleId="TableNormal">

</xml_diff>

<commit_message>
Update phần 1.b.image & phần 2
</commit_message>
<xml_diff>
--- a/doc/03-LeTranQuangThanh.docx
+++ b/doc/03-LeTranQuangThanh.docx
@@ -123,7 +123,18 @@
           <w:sz w:val="26"/>
           <w:szCs w:val="26"/>
         </w:rPr>
-        <w:t>- Thành viên nhóm</w:t>
+        <w:t xml:space="preserve">- Thành viên </w:t>
+      </w:r>
+      <w:proofErr w:type="gramStart"/>
+      <w:r>
+        <w:rPr>
+          <w:rFonts w:ascii="Times New Roman" w:hAnsi="Times New Roman" w:cs="Times New Roman"/>
+          <w:b/>
+          <w:bCs/>
+          <w:sz w:val="26"/>
+          <w:szCs w:val="26"/>
+        </w:rPr>
+        <w:t>nhóm</w:t>
       </w:r>
       <w:r>
         <w:rPr>
@@ -135,6 +146,7 @@
         </w:rPr>
         <w:t xml:space="preserve"> :</w:t>
       </w:r>
+      <w:proofErr w:type="gramEnd"/>
     </w:p>
     <w:p>
       <w:pPr>
@@ -3567,6 +3579,75 @@
           <w:szCs w:val="26"/>
         </w:rPr>
       </w:pPr>
+    </w:p>
+    <w:p>
+      <w:pPr>
+        <w:pStyle w:val="ListParagraph"/>
+        <w:spacing w:after="120"/>
+        <w:jc w:val="both"/>
+        <w:rPr>
+          <w:rFonts w:ascii="Times New Roman" w:hAnsi="Times New Roman" w:cs="Times New Roman"/>
+          <w:b/>
+          <w:sz w:val="26"/>
+          <w:szCs w:val="26"/>
+        </w:rPr>
+      </w:pPr>
+      <w:r>
+        <w:rPr>
+          <w:rFonts w:ascii="Times New Roman" w:hAnsi="Times New Roman" w:cs="Times New Roman"/>
+          <w:b/>
+          <w:sz w:val="26"/>
+          <w:szCs w:val="26"/>
+        </w:rPr>
+        <w:drawing>
+          <wp:inline distT="0" distB="0" distL="0" distR="0" wp14:anchorId="3E6BC207" wp14:editId="7A35BD47">
+            <wp:extent cx="6096000" cy="3325307"/>
+            <wp:effectExtent l="0" t="0" r="0" b="8890"/>
+            <wp:docPr id="785144151" name="Picture 5"/>
+            <wp:cNvGraphicFramePr>
+              <a:graphicFrameLocks xmlns:a="http://schemas.openxmlformats.org/drawingml/2006/main" noChangeAspect="1"/>
+            </wp:cNvGraphicFramePr>
+            <a:graphic xmlns:a="http://schemas.openxmlformats.org/drawingml/2006/main">
+              <a:graphicData uri="http://schemas.openxmlformats.org/drawingml/2006/picture">
+                <pic:pic xmlns:pic="http://schemas.openxmlformats.org/drawingml/2006/picture">
+                  <pic:nvPicPr>
+                    <pic:cNvPr id="0" name="Picture 10"/>
+                    <pic:cNvPicPr>
+                      <a:picLocks noChangeAspect="1" noChangeArrowheads="1"/>
+                    </pic:cNvPicPr>
+                  </pic:nvPicPr>
+                  <pic:blipFill>
+                    <a:blip r:embed="rId7" cstate="print">
+                      <a:extLst>
+                        <a:ext uri="{28A0092B-C50C-407E-A947-70E740481C1C}">
+                          <a14:useLocalDpi xmlns:a14="http://schemas.microsoft.com/office/drawing/2010/main" val="0"/>
+                        </a:ext>
+                      </a:extLst>
+                    </a:blip>
+                    <a:srcRect/>
+                    <a:stretch>
+                      <a:fillRect/>
+                    </a:stretch>
+                  </pic:blipFill>
+                  <pic:spPr bwMode="auto">
+                    <a:xfrm>
+                      <a:off x="0" y="0"/>
+                      <a:ext cx="6103944" cy="3329641"/>
+                    </a:xfrm>
+                    <a:prstGeom prst="rect">
+                      <a:avLst/>
+                    </a:prstGeom>
+                    <a:noFill/>
+                    <a:ln>
+                      <a:noFill/>
+                    </a:ln>
+                  </pic:spPr>
+                </pic:pic>
+              </a:graphicData>
+            </a:graphic>
+          </wp:inline>
+        </w:drawing>
+      </w:r>
     </w:p>
     <w:p>
       <w:pPr>
@@ -3830,6 +3911,336 @@
           </w:tcPr>
           <w:p>
             <w:pPr>
+              <w:jc w:val="both"/>
+              <w:rPr>
+                <w:rFonts w:ascii="Times New Roman" w:hAnsi="Times New Roman" w:cs="Times New Roman"/>
+                <w:sz w:val="24"/>
+                <w:szCs w:val="24"/>
+              </w:rPr>
+            </w:pPr>
+            <w:r>
+              <w:rPr>
+                <w:rFonts w:ascii="Times New Roman" w:hAnsi="Times New Roman" w:cs="Times New Roman"/>
+                <w:b/>
+                <w:bCs/>
+                <w:sz w:val="24"/>
+                <w:szCs w:val="24"/>
+              </w:rPr>
+              <w:t>X</w:t>
+            </w:r>
+            <w:r>
+              <w:rPr>
+                <w:rFonts w:ascii="Times New Roman" w:hAnsi="Times New Roman" w:cs="Times New Roman"/>
+                <w:b/>
+                <w:bCs/>
+                <w:sz w:val="24"/>
+                <w:szCs w:val="24"/>
+              </w:rPr>
+              <w:t>ác nhận cảnh báo y khoa:</w:t>
+            </w:r>
+            <w:r>
+              <w:rPr>
+                <w:rFonts w:ascii="Times New Roman" w:hAnsi="Times New Roman" w:cs="Times New Roman"/>
+                <w:sz w:val="24"/>
+                <w:szCs w:val="24"/>
+              </w:rPr>
+              <w:t xml:space="preserve"> Đối với cảnh báo đỏ về tiền sử bệnh lý nguy hiểm (dị ứng thuốc tê, tim mạch...), bác sĩ có bắt buộc phải thao tác "Xác nhận đã đọc" (click xác nhận/nhập mã) để mở khóa các bước tiếp theo không, hay hệ thống chỉ hiển thị thông báo thụ động?</w:t>
+            </w:r>
+          </w:p>
+        </w:tc>
+        <w:tc>
+          <w:tcPr>
+            <w:tcW w:w="1836" w:type="pct"/>
+            <w:vAlign w:val="center"/>
+          </w:tcPr>
+          <w:p>
+            <w:pPr>
+              <w:jc w:val="both"/>
+              <w:rPr>
+                <w:rFonts w:ascii="Times New Roman" w:hAnsi="Times New Roman" w:cs="Times New Roman"/>
+                <w:sz w:val="24"/>
+                <w:szCs w:val="24"/>
+              </w:rPr>
+            </w:pPr>
+            <w:r>
+              <w:rPr>
+                <w:rFonts w:ascii="Times New Roman" w:hAnsi="Times New Roman" w:cs="Times New Roman"/>
+                <w:b/>
+                <w:bCs/>
+                <w:sz w:val="24"/>
+                <w:szCs w:val="24"/>
+              </w:rPr>
+              <w:t>Chắc chắn là phải bắt buộc thao tác.</w:t>
+            </w:r>
+            <w:r>
+              <w:rPr>
+                <w:rFonts w:ascii="Times New Roman" w:hAnsi="Times New Roman" w:cs="Times New Roman"/>
+                <w:sz w:val="24"/>
+                <w:szCs w:val="24"/>
+              </w:rPr>
+              <w:t xml:space="preserve"> Đứng ở góc độ lâm sàng, tôi không chấp nhận một cảnh báo thụ động nằm ở góc màn hình. Khi đông bệnh nhân, chúng tôi lướt thao tác rất nhanh. Nếu bệnh nhân sốc phản vệ với thuốc tê hay máu không đông, hậu quả là tai biến y khoa vô cùng nghiêm trọng. Hãy thiết kế một popup đỏ khóa màn hình, buộc tôi phải bấm "Xác nhận đã nắm rủi ro" thì mới cho phép lên phác đồ hay kê đơn. Việc này vừa cứu mạng bệnh nhân, vừa bảo vệ tính pháp lý cho bác sĩ chúng tôi.</w:t>
+            </w:r>
+          </w:p>
+        </w:tc>
+        <w:tc>
+          <w:tcPr>
+            <w:tcW w:w="1330" w:type="pct"/>
+          </w:tcPr>
+          <w:p>
+            <w:pPr>
+              <w:spacing w:after="120"/>
+              <w:jc w:val="both"/>
+              <w:rPr>
+                <w:rFonts w:ascii="Times New Roman" w:hAnsi="Times New Roman" w:cs="Times New Roman"/>
+                <w:sz w:val="24"/>
+                <w:szCs w:val="24"/>
+              </w:rPr>
+            </w:pPr>
+            <w:r>
+              <w:rPr>
+                <w:rFonts w:ascii="Times New Roman" w:hAnsi="Times New Roman" w:cs="Times New Roman"/>
+                <w:sz w:val="24"/>
+                <w:szCs w:val="24"/>
+              </w:rPr>
+              <w:t>Yêu cầu đội dev thiết kế cơ chế chặn</w:t>
+            </w:r>
+            <w:r>
+              <w:rPr>
+                <w:rFonts w:ascii="Times New Roman" w:hAnsi="Times New Roman" w:cs="Times New Roman"/>
+                <w:sz w:val="24"/>
+                <w:szCs w:val="24"/>
+              </w:rPr>
+              <w:t xml:space="preserve"> </w:t>
+            </w:r>
+            <w:r>
+              <w:rPr>
+                <w:rFonts w:ascii="Times New Roman" w:hAnsi="Times New Roman" w:cs="Times New Roman"/>
+                <w:sz w:val="24"/>
+                <w:szCs w:val="24"/>
+              </w:rPr>
+              <w:t>và lưu lại lịch sử thời gian bác sĩ đã bấm xác nhận.</w:t>
+            </w:r>
+          </w:p>
+        </w:tc>
+      </w:tr>
+      <w:tr>
+        <w:trPr>
+          <w:trHeight w:val="339"/>
+        </w:trPr>
+        <w:tc>
+          <w:tcPr>
+            <w:tcW w:w="314" w:type="pct"/>
+            <w:vAlign w:val="center"/>
+          </w:tcPr>
+          <w:p>
+            <w:pPr>
+              <w:spacing w:after="120"/>
+              <w:rPr>
+                <w:rFonts w:ascii="Times New Roman" w:hAnsi="Times New Roman" w:cs="Times New Roman"/>
+                <w:sz w:val="26"/>
+                <w:szCs w:val="26"/>
+              </w:rPr>
+            </w:pPr>
+            <w:r>
+              <w:rPr>
+                <w:rFonts w:ascii="Times New Roman" w:hAnsi="Times New Roman" w:cs="Times New Roman"/>
+                <w:sz w:val="26"/>
+                <w:szCs w:val="26"/>
+              </w:rPr>
+              <w:t>2.</w:t>
+            </w:r>
+          </w:p>
+        </w:tc>
+        <w:tc>
+          <w:tcPr>
+            <w:tcW w:w="1520" w:type="pct"/>
+            <w:vAlign w:val="center"/>
+          </w:tcPr>
+          <w:p>
+            <w:pPr>
+              <w:jc w:val="both"/>
+              <w:rPr>
+                <w:rFonts w:ascii="Times New Roman" w:hAnsi="Times New Roman" w:cs="Times New Roman"/>
+                <w:sz w:val="24"/>
+                <w:szCs w:val="24"/>
+              </w:rPr>
+            </w:pPr>
+            <w:r>
+              <w:rPr>
+                <w:rFonts w:ascii="Times New Roman" w:hAnsi="Times New Roman" w:cs="Times New Roman"/>
+                <w:b/>
+                <w:bCs/>
+                <w:sz w:val="24"/>
+                <w:szCs w:val="24"/>
+              </w:rPr>
+              <w:t>T</w:t>
+            </w:r>
+            <w:r>
+              <w:rPr>
+                <w:rFonts w:ascii="Times New Roman" w:hAnsi="Times New Roman" w:cs="Times New Roman"/>
+                <w:b/>
+                <w:bCs/>
+                <w:sz w:val="24"/>
+                <w:szCs w:val="24"/>
+              </w:rPr>
+              <w:t>iêu chuẩn kỹ thuật tải file X-Ray thủ công:</w:t>
+            </w:r>
+            <w:r>
+              <w:rPr>
+                <w:rFonts w:ascii="Times New Roman" w:hAnsi="Times New Roman" w:cs="Times New Roman"/>
+                <w:sz w:val="24"/>
+                <w:szCs w:val="24"/>
+              </w:rPr>
+              <w:t xml:space="preserve"> Khi tải phim X-quang lên hệ thống thủ công, phần mềm hỗ trợ </w:t>
+            </w:r>
+            <w:r>
+              <w:rPr>
+                <w:rFonts w:ascii="Times New Roman" w:hAnsi="Times New Roman" w:cs="Times New Roman"/>
+                <w:sz w:val="24"/>
+                <w:szCs w:val="24"/>
+              </w:rPr>
+              <w:lastRenderedPageBreak/>
+              <w:t>chuẩn định dạng tệp nào (DICOM chuyên y tế hay</w:t>
+            </w:r>
+            <w:r>
+              <w:rPr>
+                <w:rFonts w:ascii="Times New Roman" w:hAnsi="Times New Roman" w:cs="Times New Roman"/>
+                <w:sz w:val="24"/>
+                <w:szCs w:val="24"/>
+              </w:rPr>
+              <w:t xml:space="preserve"> </w:t>
+            </w:r>
+            <w:r>
+              <w:rPr>
+                <w:rFonts w:ascii="Times New Roman" w:hAnsi="Times New Roman" w:cs="Times New Roman"/>
+                <w:sz w:val="24"/>
+                <w:szCs w:val="24"/>
+              </w:rPr>
+              <w:t>PNG/JPG</w:t>
+            </w:r>
+            <w:r>
+              <w:rPr>
+                <w:rFonts w:ascii="Times New Roman" w:hAnsi="Times New Roman" w:cs="Times New Roman"/>
+                <w:sz w:val="24"/>
+                <w:szCs w:val="24"/>
+              </w:rPr>
+              <w:t xml:space="preserve"> </w:t>
+            </w:r>
+            <w:r>
+              <w:rPr>
+                <w:rFonts w:ascii="Times New Roman" w:hAnsi="Times New Roman" w:cs="Times New Roman"/>
+                <w:sz w:val="24"/>
+                <w:szCs w:val="24"/>
+              </w:rPr>
+              <w:t>thông thường)? Mức dung lượng tối đa cho mỗi tệp là bao nhiêu để đảm bảo hiệu suất cho giao diện xem song song?</w:t>
+            </w:r>
+          </w:p>
+        </w:tc>
+        <w:tc>
+          <w:tcPr>
+            <w:tcW w:w="1836" w:type="pct"/>
+            <w:vAlign w:val="center"/>
+          </w:tcPr>
+          <w:p>
+            <w:pPr>
+              <w:jc w:val="both"/>
+              <w:rPr>
+                <w:rFonts w:ascii="Times New Roman" w:hAnsi="Times New Roman" w:cs="Times New Roman"/>
+                <w:sz w:val="24"/>
+                <w:szCs w:val="24"/>
+              </w:rPr>
+            </w:pPr>
+            <w:r>
+              <w:rPr>
+                <w:rFonts w:ascii="Times New Roman" w:hAnsi="Times New Roman" w:cs="Times New Roman"/>
+                <w:b/>
+                <w:bCs/>
+                <w:sz w:val="24"/>
+                <w:szCs w:val="24"/>
+              </w:rPr>
+              <w:lastRenderedPageBreak/>
+              <w:t>Phải hỗ trợ cả hai.</w:t>
+            </w:r>
+            <w:r>
+              <w:rPr>
+                <w:rFonts w:ascii="Times New Roman" w:hAnsi="Times New Roman" w:cs="Times New Roman"/>
+                <w:sz w:val="24"/>
+                <w:szCs w:val="24"/>
+              </w:rPr>
+              <w:t xml:space="preserve"> Chúng tôi cần đọc phim CT Conebeam, Panorama (bắt buộc phải là chuẩn DICOM), nhưng cũng cần tải lên ảnh chụp </w:t>
+            </w:r>
+            <w:r>
+              <w:rPr>
+                <w:rFonts w:ascii="Times New Roman" w:hAnsi="Times New Roman" w:cs="Times New Roman"/>
+                <w:sz w:val="24"/>
+                <w:szCs w:val="24"/>
+              </w:rPr>
+              <w:lastRenderedPageBreak/>
+              <w:t>khoang miệng thực tế từ camera nội soi (chỉ là JPG/PNG). Về dung lượng, các bạn có thể giới hạn ở mức 50MB/tệp. Tuy nhiên, cái tôi quan tâm nhất là tốc độ hiển thị. Khi tôi ngồi cạnh bệnh nhân mở chế độ Split-view, phần mềm tuyệt đối không được giật lag. Các bạn hãy làm sao để ảnh hiển thị ban đầu load thật nhanh, chỉ khi tôi cần phóng to để soi kỹ một ống tủy hay mật độ xương thì hệ thống mới cần tải chi tiết ảnh gốc.</w:t>
+            </w:r>
+          </w:p>
+        </w:tc>
+        <w:tc>
+          <w:tcPr>
+            <w:tcW w:w="1330" w:type="pct"/>
+          </w:tcPr>
+          <w:p>
+            <w:pPr>
+              <w:spacing w:after="120"/>
+              <w:jc w:val="both"/>
+              <w:rPr>
+                <w:rFonts w:ascii="Times New Roman" w:hAnsi="Times New Roman" w:cs="Times New Roman"/>
+                <w:sz w:val="24"/>
+                <w:szCs w:val="24"/>
+              </w:rPr>
+            </w:pPr>
+            <w:r>
+              <w:rPr>
+                <w:rFonts w:ascii="Times New Roman" w:hAnsi="Times New Roman" w:cs="Times New Roman"/>
+                <w:sz w:val="24"/>
+                <w:szCs w:val="24"/>
+              </w:rPr>
+              <w:lastRenderedPageBreak/>
+              <w:t>Cần lưu ý tối ưu hóa UX/UI cho bác sĩ: Tốc độ load nhanh là ưu tiên hàng đầu trong phòng khám.</w:t>
+            </w:r>
+          </w:p>
+        </w:tc>
+      </w:tr>
+      <w:tr>
+        <w:trPr>
+          <w:trHeight w:val="339"/>
+        </w:trPr>
+        <w:tc>
+          <w:tcPr>
+            <w:tcW w:w="314" w:type="pct"/>
+            <w:vAlign w:val="center"/>
+          </w:tcPr>
+          <w:p>
+            <w:pPr>
+              <w:spacing w:after="120"/>
+              <w:rPr>
+                <w:rFonts w:ascii="Times New Roman" w:hAnsi="Times New Roman" w:cs="Times New Roman"/>
+                <w:sz w:val="26"/>
+                <w:szCs w:val="26"/>
+              </w:rPr>
+            </w:pPr>
+            <w:r>
+              <w:rPr>
+                <w:rFonts w:ascii="Times New Roman" w:hAnsi="Times New Roman" w:cs="Times New Roman"/>
+                <w:sz w:val="26"/>
+                <w:szCs w:val="26"/>
+              </w:rPr>
+              <w:t>3.</w:t>
+            </w:r>
+          </w:p>
+        </w:tc>
+        <w:tc>
+          <w:tcPr>
+            <w:tcW w:w="1520" w:type="pct"/>
+            <w:vAlign w:val="center"/>
+          </w:tcPr>
+          <w:p>
+            <w:pPr>
               <w:spacing w:after="120"/>
               <w:jc w:val="both"/>
               <w:rPr>
@@ -3898,7 +4309,7 @@
                 <w:sz w:val="26"/>
                 <w:szCs w:val="26"/>
               </w:rPr>
-              <w:t>2.</w:t>
+              <w:t>4.</w:t>
             </w:r>
           </w:p>
         </w:tc>
@@ -3977,7 +4388,7 @@
                 <w:sz w:val="26"/>
                 <w:szCs w:val="26"/>
               </w:rPr>
-              <w:t>3.</w:t>
+              <w:t>5.</w:t>
             </w:r>
           </w:p>
         </w:tc>
@@ -4056,7 +4467,7 @@
                 <w:sz w:val="26"/>
                 <w:szCs w:val="26"/>
               </w:rPr>
-              <w:t>4.</w:t>
+              <w:t>6.</w:t>
             </w:r>
           </w:p>
         </w:tc>
@@ -4135,7 +4546,7 @@
                 <w:sz w:val="26"/>
                 <w:szCs w:val="26"/>
               </w:rPr>
-              <w:t>5.</w:t>
+              <w:t>7.</w:t>
             </w:r>
           </w:p>
         </w:tc>
@@ -4214,7 +4625,7 @@
                 <w:sz w:val="26"/>
                 <w:szCs w:val="26"/>
               </w:rPr>
-              <w:t>6.</w:t>
+              <w:t>8.</w:t>
             </w:r>
           </w:p>
         </w:tc>
@@ -4293,7 +4704,7 @@
                 <w:sz w:val="26"/>
                 <w:szCs w:val="26"/>
               </w:rPr>
-              <w:t>7.</w:t>
+              <w:t>…</w:t>
             </w:r>
           </w:p>
         </w:tc>
@@ -4372,85 +4783,6 @@
                 <w:sz w:val="26"/>
                 <w:szCs w:val="26"/>
               </w:rPr>
-              <w:t>8.</w:t>
-            </w:r>
-          </w:p>
-        </w:tc>
-        <w:tc>
-          <w:tcPr>
-            <w:tcW w:w="1520" w:type="pct"/>
-            <w:vAlign w:val="center"/>
-          </w:tcPr>
-          <w:p>
-            <w:pPr>
-              <w:spacing w:after="120"/>
-              <w:jc w:val="both"/>
-              <w:rPr>
-                <w:rFonts w:ascii="Times New Roman" w:hAnsi="Times New Roman" w:cs="Times New Roman"/>
-                <w:sz w:val="26"/>
-                <w:szCs w:val="26"/>
-              </w:rPr>
-            </w:pPr>
-          </w:p>
-        </w:tc>
-        <w:tc>
-          <w:tcPr>
-            <w:tcW w:w="1836" w:type="pct"/>
-            <w:vAlign w:val="center"/>
-          </w:tcPr>
-          <w:p>
-            <w:pPr>
-              <w:spacing w:after="120"/>
-              <w:jc w:val="both"/>
-              <w:rPr>
-                <w:rFonts w:ascii="Times New Roman" w:hAnsi="Times New Roman" w:cs="Times New Roman"/>
-                <w:sz w:val="26"/>
-                <w:szCs w:val="26"/>
-              </w:rPr>
-            </w:pPr>
-          </w:p>
-        </w:tc>
-        <w:tc>
-          <w:tcPr>
-            <w:tcW w:w="1330" w:type="pct"/>
-          </w:tcPr>
-          <w:p>
-            <w:pPr>
-              <w:spacing w:after="120"/>
-              <w:jc w:val="both"/>
-              <w:rPr>
-                <w:rFonts w:ascii="Times New Roman" w:hAnsi="Times New Roman" w:cs="Times New Roman"/>
-                <w:sz w:val="26"/>
-                <w:szCs w:val="26"/>
-              </w:rPr>
-            </w:pPr>
-          </w:p>
-        </w:tc>
-      </w:tr>
-      <w:tr>
-        <w:trPr>
-          <w:trHeight w:val="339"/>
-        </w:trPr>
-        <w:tc>
-          <w:tcPr>
-            <w:tcW w:w="314" w:type="pct"/>
-            <w:vAlign w:val="center"/>
-          </w:tcPr>
-          <w:p>
-            <w:pPr>
-              <w:spacing w:after="120"/>
-              <w:rPr>
-                <w:rFonts w:ascii="Times New Roman" w:hAnsi="Times New Roman" w:cs="Times New Roman"/>
-                <w:sz w:val="26"/>
-                <w:szCs w:val="26"/>
-              </w:rPr>
-            </w:pPr>
-            <w:r>
-              <w:rPr>
-                <w:rFonts w:ascii="Times New Roman" w:hAnsi="Times New Roman" w:cs="Times New Roman"/>
-                <w:sz w:val="26"/>
-                <w:szCs w:val="26"/>
-              </w:rPr>
               <w:t>…</w:t>
             </w:r>
           </w:p>
@@ -4506,85 +4838,6 @@
           </w:p>
         </w:tc>
       </w:tr>
-      <w:tr>
-        <w:trPr>
-          <w:trHeight w:val="339"/>
-        </w:trPr>
-        <w:tc>
-          <w:tcPr>
-            <w:tcW w:w="314" w:type="pct"/>
-            <w:vAlign w:val="center"/>
-          </w:tcPr>
-          <w:p>
-            <w:pPr>
-              <w:spacing w:after="120"/>
-              <w:rPr>
-                <w:rFonts w:ascii="Times New Roman" w:hAnsi="Times New Roman" w:cs="Times New Roman"/>
-                <w:sz w:val="26"/>
-                <w:szCs w:val="26"/>
-              </w:rPr>
-            </w:pPr>
-            <w:r>
-              <w:rPr>
-                <w:rFonts w:ascii="Times New Roman" w:hAnsi="Times New Roman" w:cs="Times New Roman"/>
-                <w:sz w:val="26"/>
-                <w:szCs w:val="26"/>
-              </w:rPr>
-              <w:t>…</w:t>
-            </w:r>
-          </w:p>
-        </w:tc>
-        <w:tc>
-          <w:tcPr>
-            <w:tcW w:w="1520" w:type="pct"/>
-            <w:vAlign w:val="center"/>
-          </w:tcPr>
-          <w:p>
-            <w:pPr>
-              <w:spacing w:after="120"/>
-              <w:jc w:val="both"/>
-              <w:rPr>
-                <w:rFonts w:ascii="Times New Roman" w:hAnsi="Times New Roman" w:cs="Times New Roman"/>
-                <w:sz w:val="26"/>
-                <w:szCs w:val="26"/>
-              </w:rPr>
-            </w:pPr>
-          </w:p>
-        </w:tc>
-        <w:tc>
-          <w:tcPr>
-            <w:tcW w:w="1836" w:type="pct"/>
-            <w:vAlign w:val="center"/>
-          </w:tcPr>
-          <w:p>
-            <w:pPr>
-              <w:spacing w:after="120"/>
-              <w:jc w:val="both"/>
-              <w:rPr>
-                <w:rFonts w:ascii="Times New Roman" w:hAnsi="Times New Roman" w:cs="Times New Roman"/>
-                <w:sz w:val="26"/>
-                <w:szCs w:val="26"/>
-              </w:rPr>
-            </w:pPr>
-          </w:p>
-        </w:tc>
-        <w:tc>
-          <w:tcPr>
-            <w:tcW w:w="1330" w:type="pct"/>
-          </w:tcPr>
-          <w:p>
-            <w:pPr>
-              <w:spacing w:after="120"/>
-              <w:jc w:val="both"/>
-              <w:rPr>
-                <w:rFonts w:ascii="Times New Roman" w:hAnsi="Times New Roman" w:cs="Times New Roman"/>
-                <w:sz w:val="26"/>
-                <w:szCs w:val="26"/>
-              </w:rPr>
-            </w:pPr>
-          </w:p>
-        </w:tc>
-      </w:tr>
     </w:tbl>
     <w:p>
       <w:pPr>
@@ -4782,12 +5035,12 @@
       </w:pPr>
     </w:p>
     <w:sectPr>
-      <w:headerReference w:type="even" r:id="rId7"/>
-      <w:headerReference w:type="default" r:id="rId8"/>
-      <w:footerReference w:type="even" r:id="rId9"/>
-      <w:footerReference w:type="default" r:id="rId10"/>
-      <w:headerReference w:type="first" r:id="rId11"/>
-      <w:footerReference w:type="first" r:id="rId12"/>
+      <w:headerReference w:type="even" r:id="rId8"/>
+      <w:headerReference w:type="default" r:id="rId9"/>
+      <w:footerReference w:type="even" r:id="rId10"/>
+      <w:footerReference w:type="default" r:id="rId11"/>
+      <w:headerReference w:type="first" r:id="rId12"/>
+      <w:footerReference w:type="first" r:id="rId13"/>
       <w:pgSz w:w="12240" w:h="15840" w:code="1"/>
       <w:pgMar w:top="851" w:right="851" w:bottom="851" w:left="1134" w:header="567" w:footer="567" w:gutter="0"/>
       <w:cols w:space="720"/>
@@ -9133,7 +9386,6 @@
   <w:style w:type="character" w:default="1" w:styleId="DefaultParagraphFont">
     <w:name w:val="Default Paragraph Font"/>
     <w:uiPriority w:val="1"/>
-    <w:semiHidden/>
     <w:unhideWhenUsed/>
   </w:style>
   <w:style w:type="table" w:default="1" w:styleId="TableNormal">

</xml_diff>